<commit_message>
fix(p3-vi): retranslate "institutional scaffolding" via terminology skill
Replaces the awkward literal renderings "giàn đỡ thể chế" / "giàn giáo hậu
NDTP" with the standardized descriptive term "khung thể chế hỗ trợ" (per the
academic-translation terminology decision tree), and records it in the
glossary (entry 57). Rebuilds P3 Vietnamese docx + PDF.

https://claude.ai/code/session_01TqgqRfCDLY39798jcQXCr9
</commit_message>
<xml_diff>
--- a/dist/downloads/manuscripts_vi/p3_vietnam_vi.docx
+++ b/dist/downloads/manuscripts_vi/p3_vietnam_vi.docx
@@ -505,7 +505,7 @@
         <w:pStyle w:val="BodyText"/>
       </w:pPr>
       <w:r>
-        <w:t xml:space="preserve">Những thay đổi này không chỉ là bề mặt. Bản thân thành phần nhóm xuất khẩu cũng tiến hóa qua ba đợt: tỷ lệ doanh nghiệp báo cáo bất kỳ cường độ xuất khẩu trực tiếp dương nào giảm khi các doanh nghiệp dịch vụ và chuỗi cung ứng liên kết FDI gia nhập mẫu, trong khi mức độ áp dụng số nền tảng trung bình tăng cùng với sự lan rộng của website, hệ thống thanh toán điện tử và giao diện giao dịch số. Đọc mối quan hệ I–P và kênh áp dụng số như những sự kiện cấu trúc cố định qua cửa sổ mười bốn năm này bỏ lỡ thực tế rằng dân số doanh nghiệp cơ bản, chi phí phối hợp ràng buộc và giàn đỡ thể chế cho thương mại xuyên biên giới đều thay đổi đáng kể.</w:t>
+        <w:t xml:space="preserve">Những thay đổi này không chỉ là bề mặt. Bản thân thành phần nhóm xuất khẩu cũng tiến hóa qua ba đợt: tỷ lệ doanh nghiệp báo cáo bất kỳ cường độ xuất khẩu trực tiếp dương nào giảm khi các doanh nghiệp dịch vụ và chuỗi cung ứng liên kết FDI gia nhập mẫu, trong khi mức độ áp dụng số nền tảng trung bình tăng cùng với sự lan rộng của website, hệ thống thanh toán điện tử và giao diện giao dịch số. Đọc mối quan hệ I–P và kênh áp dụng số như những sự kiện cấu trúc cố định qua cửa sổ mười bốn năm này bỏ lỡ thực tế rằng dân số doanh nghiệp cơ bản, chi phí phối hợp ràng buộc và khung thể chế hỗ trợ thương mại xuyên biên giới đều thay đổi đáng kể.</w:t>
       </w:r>
     </w:p>
     <w:p>
@@ -20348,7 +20348,7 @@
         <w:pStyle w:val="BodyText"/>
       </w:pPr>
       <w:r>
-        <w:t xml:space="preserve">Chương trình Chuyển đổi số Quốc gia (National Digital Transformation Programme — NDTP) của Việt Nam được ban hành năm 2020, và các nền tảng thanh toán điện tử xuyên biên giới (VNPAY, MoMo, ZaloPay) và các sàn giao dịch B2B dành cho nhà xuất khẩu (Alibaba.com, Amazon Global Selling) chỉ đạt quy mô tại Việt Nam sau năm 2018–2019. Đợt sóng 2015 do đó quan sát các nhà xuất khẩu Việt Nam trong giai đoạn hạ tầng chuyển đổi khi một website chưa thể kết nối với hệ sinh thái số hỗ trợ giao dịch; đợt sóng 2023 quan sát họ sau khi giàn giáo hậu NDTP đã trưởng thành. Nghiên cứu này không coi các chỉ số vĩ mô này là biến thể nhận diện — chúng không được đưa vào hồi quy — nhưng chúng làm cho cách đọc theo đợt sóng có tính khả tín về mặt thể chế thay vì thuần túy là hậu nghiệm.</w:t>
+        <w:t xml:space="preserve">Chương trình Chuyển đổi số Quốc gia (National Digital Transformation Programme — NDTP) của Việt Nam được ban hành năm 2020, và các nền tảng thanh toán điện tử xuyên biên giới (VNPAY, MoMo, ZaloPay) và các sàn giao dịch B2B dành cho nhà xuất khẩu (Alibaba.com, Amazon Global Selling) chỉ đạt quy mô tại Việt Nam sau năm 2018–2019. Đợt sóng 2015 do đó quan sát các nhà xuất khẩu Việt Nam trong giai đoạn hạ tầng chuyển đổi khi một website chưa thể kết nối với hệ sinh thái số hỗ trợ giao dịch; đợt sóng 2023 quan sát họ sau khi khung thể chế hỗ trợ hậu NDTP đã trưởng thành. Nghiên cứu này không coi các chỉ số vĩ mô này là biến thể nhận diện — chúng không được đưa vào hồi quy — nhưng chúng làm cho cách đọc theo đợt sóng có tính khả tín về mặt thể chế thay vì thuần túy là hậu nghiệm.</w:t>
       </w:r>
     </w:p>
     <w:p>

</xml_diff>